<commit_message>
Sửa 1 số lỗi, thêm tài nguyên và 1 số tính năng
</commit_message>
<xml_diff>
--- a/ban_giao_dev/Kich_ban_Chuong_5.docx
+++ b/ban_giao_dev/Kich_ban_Chuong_5.docx
@@ -2694,30 +2694,6 @@
       </w:pPr>
       <w:r>
         <w:t xml:space="preserve">• [TRẢ: "Lên tới nơi tôi tháo"]</w:t>
-      </w:r>
-    </w:p>
-    <w:p>
-      <w:pPr>
-        <w:ind w:left="980" w:hanging="280"/>
-      </w:pPr>
-      <w:r>
-        <w:t xml:space="preserve">• Nếu không:</w:t>
-      </w:r>
-    </w:p>
-    <w:p>
-      <w:pPr>
-        <w:ind w:left="1400" w:hanging="280"/>
-      </w:pPr>
-      <w:r>
-        <w:t xml:space="preserve">• Kael: "Cái này tôi mang lên cho chỗ cấp con số xem. Ông có cấp con số không?"</w:t>
-      </w:r>
-    </w:p>
-    <w:p>
-      <w:pPr>
-        <w:ind w:left="1400" w:hanging="280"/>
-      </w:pPr>
-      <w:r>
-        <w:t xml:space="preserve">• Soren: "Tôi giữ thang. Thế là đủ để thu nó."</w:t>
       </w:r>
     </w:p>
     <w:p>

</xml_diff>